<commit_message>
v16: add abstract, introduction, methods and conclusions; global reference renumbering; fix italics in v15 7.1
</commit_message>
<xml_diff>
--- a/3-7_v15_clean.docx
+++ b/3-7_v15_clean.docx
@@ -7555,7 +7555,7 @@
         <w:t xml:space="preserve">[133]</w:t>
       </w:r>
       <w:r>
-        <w:t xml:space="preserve">。其次，圈养个体不宜直接作为野生参照：所研究的圈养灰原鸡常染色体基因组中约10%来自*</w:t>
+        <w:t xml:space="preserve">。其次，圈养个体不宜直接作为野生参照：所研究的圈养灰原鸡常染色体基因组中约10%来自</w:t>
       </w:r>
       <w:r>
         <w:rPr>
@@ -7564,7 +7564,7 @@
         <w:t xml:space="preserve">G. gallus</w:t>
       </w:r>
       <w:r>
-        <w:t xml:space="preserve">*，而同一研究中的两只野生灰原鸡未检出相应信号</w:t>
+        <w:t xml:space="preserve">，而同一研究中的两只野生灰原鸡未检出相应信号</w:t>
       </w:r>
       <w:r>
         <w:rPr>
@@ -7573,7 +7573,7 @@
         <w:t xml:space="preserve">[134]</w:t>
       </w:r>
       <w:r>
-        <w:t xml:space="preserve">；动物园圈养红原鸡虽源自*</w:t>
+        <w:t xml:space="preserve">；动物园圈养红原鸡虽源自</w:t>
       </w:r>
       <w:r>
         <w:rPr>
@@ -7582,7 +7582,7 @@
         <w:t xml:space="preserve">G. g. spadiceus</w:t>
       </w:r>
       <w:r>
-        <w:t xml:space="preserve">*，却经历了严重的群体瓶颈，遗传多样性降低，并带有极长的纯合片段</w:t>
+        <w:t xml:space="preserve">，却经历了严重的群体瓶颈，遗传多样性降低，并带有极长的纯合片段</w:t>
       </w:r>
       <w:r>
         <w:rPr>

</xml_diff>